<commit_message>
docs(guia): agrega seccion 'Pendiente por definir' (decisiones para Juan)
Incluye: nombre de la seccion de Cajas, base costo/precio de valorizacion, desglose de
margen sobre lo valorizado, tipo de cambio manual vs automatico, armadas por facturar y
pegado desde MS Project. No se renombro nada (se dejo como esta, por decision del usuario).

Co-Authored-By: Claude Opus 4.8 <noreply@anthropic.com>
</commit_message>
<xml_diff>
--- a/GUIA_PRUEBAS_ACTUALIZACIONES_AZUR.docx
+++ b/GUIA_PRUEBAS_ACTUALIZACIONES_AZUR.docx
@@ -8949,7 +8949,801 @@
           <w:color w:val="E20627"/>
           <w:sz w:val="32"/>
         </w:rPr>
-        <w:t>7. Registro general de observaciones</w:t>
+        <w:t>7. Pendiente por definir (decisiones para Juan)</w:t>
+      </w:r>
+    </w:p>
+    <w:p>
+      <w:r>
+        <w:rPr>
+          <w:color w:val="666666"/>
+          <w:sz w:val="20"/>
+        </w:rPr>
+        <w:t>Estos puntos quedan ABIERTOS: el sistema ya tiene la base, pero falta la decisión de Juan/David para dejarlos en su forma final. Marquen la decisión en la última columna.</w:t>
+      </w:r>
+    </w:p>
+    <w:p>
+      <w:pPr>
+        <w:pStyle w:val="Heading2"/>
+      </w:pPr>
+      <w:r>
+        <w:rPr>
+          <w:color w:val="BE1723"/>
+          <w:sz w:val="26"/>
+        </w:rPr>
+        <w:t>7.1 Nombre de la sección de Cajas</w:t>
+      </w:r>
+    </w:p>
+    <w:p>
+      <w:r>
+        <w:rPr>
+          <w:b/>
+          <w:color w:val="BE1723"/>
+          <w:sz w:val="20"/>
+        </w:rPr>
+        <w:t xml:space="preserve">Estado actual: </w:t>
+      </w:r>
+      <w:r>
+        <w:rPr>
+          <w:sz w:val="20"/>
+        </w:rPr>
+        <w:t>Hoy se dejó como 'Cajas' (ya muestra arriba 'Estado financiero por proyecto' y debajo 'Cajas chicas'). En la reunión Juan propuso 'Presupuesto del proyecto' y David 'Estado del proyecto'; no se acordó un único nombre.</w:t>
+      </w:r>
+    </w:p>
+    <w:p>
+      <w:r>
+        <w:rPr>
+          <w:b/>
+          <w:color w:val="E20627"/>
+          <w:sz w:val="20"/>
+        </w:rPr>
+        <w:t xml:space="preserve">Opciones a decidir: </w:t>
+      </w:r>
+      <w:r>
+        <w:rPr>
+          <w:sz w:val="20"/>
+        </w:rPr>
+        <w:t>Dejar 'Cajas' · 'Presupuesto y cajas' · 'Estado del proyecto' · 'Presupuesto del proyecto'.</w:t>
+      </w:r>
+    </w:p>
+    <w:tbl>
+      <w:tblPr>
+        <w:tblStyle w:val="TableGrid"/>
+        <w:tblW w:type="auto" w:w="0"/>
+        <w:tblLook w:firstColumn="1" w:firstRow="1" w:lastColumn="0" w:lastRow="0" w:noHBand="0" w:noVBand="1" w:val="04A0"/>
+      </w:tblPr>
+      <w:tblGrid>
+        <w:gridCol w:w="4320"/>
+        <w:gridCol w:w="4320"/>
+      </w:tblGrid>
+      <w:tr>
+        <w:tc>
+          <w:tcPr>
+            <w:tcW w:type="dxa" w:w="4608"/>
+            <w:shd w:val="clear" w:fill="BE1723"/>
+          </w:tcPr>
+          <w:p>
+            <w:pPr>
+              <w:jc w:val="center"/>
+            </w:pPr>
+            <w:r/>
+            <w:r>
+              <w:rPr>
+                <w:b/>
+                <w:color w:val="FFFFFF"/>
+                <w:sz w:val="18"/>
+              </w:rPr>
+              <w:t>Decisión de Juan/David</w:t>
+            </w:r>
+          </w:p>
+        </w:tc>
+        <w:tc>
+          <w:tcPr>
+            <w:tcW w:type="dxa" w:w="4752"/>
+            <w:shd w:val="clear" w:fill="BE1723"/>
+          </w:tcPr>
+          <w:p>
+            <w:pPr>
+              <w:jc w:val="center"/>
+            </w:pPr>
+            <w:r/>
+            <w:r>
+              <w:rPr>
+                <w:b/>
+                <w:color w:val="FFFFFF"/>
+                <w:sz w:val="18"/>
+              </w:rPr>
+              <w:t>Comentario</w:t>
+            </w:r>
+          </w:p>
+        </w:tc>
+      </w:tr>
+      <w:tr>
+        <w:tc>
+          <w:tcPr>
+            <w:tcW w:type="dxa" w:w="4608"/>
+          </w:tcPr>
+          <w:p>
+            <w:r/>
+            <w:r>
+              <w:rPr>
+                <w:b w:val="0"/>
+                <w:sz w:val="20"/>
+              </w:rPr>
+            </w:r>
+          </w:p>
+        </w:tc>
+        <w:tc>
+          <w:tcPr>
+            <w:tcW w:type="dxa" w:w="4752"/>
+          </w:tcPr>
+          <w:p>
+            <w:r/>
+            <w:r>
+              <w:rPr>
+                <w:b w:val="0"/>
+                <w:sz w:val="20"/>
+              </w:rPr>
+            </w:r>
+          </w:p>
+        </w:tc>
+      </w:tr>
+    </w:tbl>
+    <w:p/>
+    <w:p>
+      <w:pPr>
+        <w:pStyle w:val="Heading2"/>
+      </w:pPr>
+      <w:r>
+        <w:rPr>
+          <w:color w:val="BE1723"/>
+          <w:sz w:val="26"/>
+        </w:rPr>
+        <w:t>7.2 Base de la valorización y el cobro: Costo o Precio</w:t>
+      </w:r>
+    </w:p>
+    <w:p>
+      <w:r>
+        <w:rPr>
+          <w:b/>
+          <w:color w:val="BE1723"/>
+          <w:sz w:val="20"/>
+        </w:rPr>
+        <w:t xml:space="preserve">Estado actual: </w:t>
+      </w:r>
+      <w:r>
+        <w:rPr>
+          <w:sz w:val="20"/>
+        </w:rPr>
+        <w:t>Ya existe el interruptor por proyecto (Resumen → 'Base de valorización / cobro'). Por defecto está en COSTO (itemizado). En 'Precio' aplica el margen del contrato (factor = contrato ÷ costo directo) a valorizado, saldo, cobro e informe.</w:t>
+      </w:r>
+    </w:p>
+    <w:p>
+      <w:r>
+        <w:rPr>
+          <w:b/>
+          <w:color w:val="E20627"/>
+          <w:sz w:val="20"/>
+        </w:rPr>
+        <w:t xml:space="preserve">Opciones a decidir: </w:t>
+      </w:r>
+      <w:r>
+        <w:rPr>
+          <w:sz w:val="20"/>
+        </w:rPr>
+        <w:t>Definir cuál usan por defecto (Costo o Precio) y si se fija a nivel empresa o por proyecto.</w:t>
+      </w:r>
+    </w:p>
+    <w:tbl>
+      <w:tblPr>
+        <w:tblStyle w:val="TableGrid"/>
+        <w:tblW w:type="auto" w:w="0"/>
+        <w:tblLook w:firstColumn="1" w:firstRow="1" w:lastColumn="0" w:lastRow="0" w:noHBand="0" w:noVBand="1" w:val="04A0"/>
+      </w:tblPr>
+      <w:tblGrid>
+        <w:gridCol w:w="4320"/>
+        <w:gridCol w:w="4320"/>
+      </w:tblGrid>
+      <w:tr>
+        <w:tc>
+          <w:tcPr>
+            <w:tcW w:type="dxa" w:w="4608"/>
+            <w:shd w:val="clear" w:fill="BE1723"/>
+          </w:tcPr>
+          <w:p>
+            <w:pPr>
+              <w:jc w:val="center"/>
+            </w:pPr>
+            <w:r/>
+            <w:r>
+              <w:rPr>
+                <w:b/>
+                <w:color w:val="FFFFFF"/>
+                <w:sz w:val="18"/>
+              </w:rPr>
+              <w:t>Decisión de Juan/David</w:t>
+            </w:r>
+          </w:p>
+        </w:tc>
+        <w:tc>
+          <w:tcPr>
+            <w:tcW w:type="dxa" w:w="4752"/>
+            <w:shd w:val="clear" w:fill="BE1723"/>
+          </w:tcPr>
+          <w:p>
+            <w:pPr>
+              <w:jc w:val="center"/>
+            </w:pPr>
+            <w:r/>
+            <w:r>
+              <w:rPr>
+                <w:b/>
+                <w:color w:val="FFFFFF"/>
+                <w:sz w:val="18"/>
+              </w:rPr>
+              <w:t>Comentario</w:t>
+            </w:r>
+          </w:p>
+        </w:tc>
+      </w:tr>
+      <w:tr>
+        <w:tc>
+          <w:tcPr>
+            <w:tcW w:type="dxa" w:w="4608"/>
+          </w:tcPr>
+          <w:p>
+            <w:r/>
+            <w:r>
+              <w:rPr>
+                <w:b w:val="0"/>
+                <w:sz w:val="20"/>
+              </w:rPr>
+            </w:r>
+          </w:p>
+        </w:tc>
+        <w:tc>
+          <w:tcPr>
+            <w:tcW w:type="dxa" w:w="4752"/>
+          </w:tcPr>
+          <w:p>
+            <w:r/>
+            <w:r>
+              <w:rPr>
+                <w:b w:val="0"/>
+                <w:sz w:val="20"/>
+              </w:rPr>
+            </w:r>
+          </w:p>
+        </w:tc>
+      </w:tr>
+    </w:tbl>
+    <w:p/>
+    <w:p>
+      <w:pPr>
+        <w:pStyle w:val="Heading2"/>
+      </w:pPr>
+      <w:r>
+        <w:rPr>
+          <w:color w:val="BE1723"/>
+          <w:sz w:val="26"/>
+        </w:rPr>
+        <w:t>7.3 Desglose del margen sobre lo valorizado (GG/GA/utilidad/IGV)</w:t>
+      </w:r>
+    </w:p>
+    <w:p>
+      <w:r>
+        <w:rPr>
+          <w:b/>
+          <w:color w:val="BE1723"/>
+          <w:sz w:val="20"/>
+        </w:rPr>
+        <w:t xml:space="preserve">Estado actual: </w:t>
+      </w:r>
+      <w:r>
+        <w:rPr>
+          <w:sz w:val="20"/>
+        </w:rPr>
+        <w:t>El Excel de Juan muestra, debajo de las valorizaciones, el desglose GG/GA/utilidad/IGV aplicado al total valorizado. Hoy NO se muestra ese cuadro en el informe (solo el adelanto/amortización/cobro neto).</w:t>
+      </w:r>
+    </w:p>
+    <w:p>
+      <w:r>
+        <w:rPr>
+          <w:b/>
+          <w:color w:val="E20627"/>
+          <w:sz w:val="20"/>
+        </w:rPr>
+        <w:t xml:space="preserve">Opciones a decidir: </w:t>
+      </w:r>
+      <w:r>
+        <w:rPr>
+          <w:sz w:val="20"/>
+        </w:rPr>
+        <w:t>Decidir si se agrega ese cuadro al informe de valorización (depende de 7.2: aplica cuando se cobra 'a precio').</w:t>
+      </w:r>
+    </w:p>
+    <w:tbl>
+      <w:tblPr>
+        <w:tblStyle w:val="TableGrid"/>
+        <w:tblW w:type="auto" w:w="0"/>
+        <w:tblLook w:firstColumn="1" w:firstRow="1" w:lastColumn="0" w:lastRow="0" w:noHBand="0" w:noVBand="1" w:val="04A0"/>
+      </w:tblPr>
+      <w:tblGrid>
+        <w:gridCol w:w="4320"/>
+        <w:gridCol w:w="4320"/>
+      </w:tblGrid>
+      <w:tr>
+        <w:tc>
+          <w:tcPr>
+            <w:tcW w:type="dxa" w:w="4608"/>
+            <w:shd w:val="clear" w:fill="BE1723"/>
+          </w:tcPr>
+          <w:p>
+            <w:pPr>
+              <w:jc w:val="center"/>
+            </w:pPr>
+            <w:r/>
+            <w:r>
+              <w:rPr>
+                <w:b/>
+                <w:color w:val="FFFFFF"/>
+                <w:sz w:val="18"/>
+              </w:rPr>
+              <w:t>Decisión de Juan/David</w:t>
+            </w:r>
+          </w:p>
+        </w:tc>
+        <w:tc>
+          <w:tcPr>
+            <w:tcW w:type="dxa" w:w="4752"/>
+            <w:shd w:val="clear" w:fill="BE1723"/>
+          </w:tcPr>
+          <w:p>
+            <w:pPr>
+              <w:jc w:val="center"/>
+            </w:pPr>
+            <w:r/>
+            <w:r>
+              <w:rPr>
+                <w:b/>
+                <w:color w:val="FFFFFF"/>
+                <w:sz w:val="18"/>
+              </w:rPr>
+              <w:t>Comentario</w:t>
+            </w:r>
+          </w:p>
+        </w:tc>
+      </w:tr>
+      <w:tr>
+        <w:tc>
+          <w:tcPr>
+            <w:tcW w:type="dxa" w:w="4608"/>
+          </w:tcPr>
+          <w:p>
+            <w:r/>
+            <w:r>
+              <w:rPr>
+                <w:b w:val="0"/>
+                <w:sz w:val="20"/>
+              </w:rPr>
+            </w:r>
+          </w:p>
+        </w:tc>
+        <w:tc>
+          <w:tcPr>
+            <w:tcW w:type="dxa" w:w="4752"/>
+          </w:tcPr>
+          <w:p>
+            <w:r/>
+            <w:r>
+              <w:rPr>
+                <w:b w:val="0"/>
+                <w:sz w:val="20"/>
+              </w:rPr>
+            </w:r>
+          </w:p>
+        </w:tc>
+      </w:tr>
+    </w:tbl>
+    <w:p/>
+    <w:p>
+      <w:pPr>
+        <w:pStyle w:val="Heading2"/>
+      </w:pPr>
+      <w:r>
+        <w:rPr>
+          <w:color w:val="BE1723"/>
+          <w:sz w:val="26"/>
+        </w:rPr>
+        <w:t>7.4 Tipo de cambio (USD)</w:t>
+      </w:r>
+    </w:p>
+    <w:p>
+      <w:r>
+        <w:rPr>
+          <w:b/>
+          <w:color w:val="BE1723"/>
+          <w:sz w:val="20"/>
+        </w:rPr>
+        <w:t xml:space="preserve">Estado actual: </w:t>
+      </w:r>
+      <w:r>
+        <w:rPr>
+          <w:sz w:val="20"/>
+        </w:rPr>
+        <w:t>Hoy el tipo de cambio lo ingresa el usuario manualmente en la cotización.</w:t>
+      </w:r>
+    </w:p>
+    <w:p>
+      <w:r>
+        <w:rPr>
+          <w:b/>
+          <w:color w:val="E20627"/>
+          <w:sz w:val="20"/>
+        </w:rPr>
+        <w:t xml:space="preserve">Opciones a decidir: </w:t>
+      </w:r>
+      <w:r>
+        <w:rPr>
+          <w:sz w:val="20"/>
+        </w:rPr>
+        <w:t>Mantener manual · o auto-completar con el dólar real (API SUNAT) dejando editar el valor.</w:t>
+      </w:r>
+    </w:p>
+    <w:tbl>
+      <w:tblPr>
+        <w:tblStyle w:val="TableGrid"/>
+        <w:tblW w:type="auto" w:w="0"/>
+        <w:tblLook w:firstColumn="1" w:firstRow="1" w:lastColumn="0" w:lastRow="0" w:noHBand="0" w:noVBand="1" w:val="04A0"/>
+      </w:tblPr>
+      <w:tblGrid>
+        <w:gridCol w:w="4320"/>
+        <w:gridCol w:w="4320"/>
+      </w:tblGrid>
+      <w:tr>
+        <w:tc>
+          <w:tcPr>
+            <w:tcW w:type="dxa" w:w="4608"/>
+            <w:shd w:val="clear" w:fill="BE1723"/>
+          </w:tcPr>
+          <w:p>
+            <w:pPr>
+              <w:jc w:val="center"/>
+            </w:pPr>
+            <w:r/>
+            <w:r>
+              <w:rPr>
+                <w:b/>
+                <w:color w:val="FFFFFF"/>
+                <w:sz w:val="18"/>
+              </w:rPr>
+              <w:t>Decisión de Juan/David</w:t>
+            </w:r>
+          </w:p>
+        </w:tc>
+        <w:tc>
+          <w:tcPr>
+            <w:tcW w:type="dxa" w:w="4752"/>
+            <w:shd w:val="clear" w:fill="BE1723"/>
+          </w:tcPr>
+          <w:p>
+            <w:pPr>
+              <w:jc w:val="center"/>
+            </w:pPr>
+            <w:r/>
+            <w:r>
+              <w:rPr>
+                <w:b/>
+                <w:color w:val="FFFFFF"/>
+                <w:sz w:val="18"/>
+              </w:rPr>
+              <w:t>Comentario</w:t>
+            </w:r>
+          </w:p>
+        </w:tc>
+      </w:tr>
+      <w:tr>
+        <w:tc>
+          <w:tcPr>
+            <w:tcW w:type="dxa" w:w="4608"/>
+          </w:tcPr>
+          <w:p>
+            <w:r/>
+            <w:r>
+              <w:rPr>
+                <w:b w:val="0"/>
+                <w:sz w:val="20"/>
+              </w:rPr>
+            </w:r>
+          </w:p>
+        </w:tc>
+        <w:tc>
+          <w:tcPr>
+            <w:tcW w:type="dxa" w:w="4752"/>
+          </w:tcPr>
+          <w:p>
+            <w:r/>
+            <w:r>
+              <w:rPr>
+                <w:b w:val="0"/>
+                <w:sz w:val="20"/>
+              </w:rPr>
+            </w:r>
+          </w:p>
+        </w:tc>
+      </w:tr>
+    </w:tbl>
+    <w:p/>
+    <w:p>
+      <w:pPr>
+        <w:pStyle w:val="Heading2"/>
+      </w:pPr>
+      <w:r>
+        <w:rPr>
+          <w:color w:val="BE1723"/>
+          <w:sz w:val="26"/>
+        </w:rPr>
+        <w:t>7.5 Armadas por facturar (cuentas por cobrar)</w:t>
+      </w:r>
+    </w:p>
+    <w:p>
+      <w:r>
+        <w:rPr>
+          <w:b/>
+          <w:color w:val="BE1723"/>
+          <w:sz w:val="20"/>
+        </w:rPr>
+        <w:t xml:space="preserve">Estado actual: </w:t>
+      </w:r>
+      <w:r>
+        <w:rPr>
+          <w:sz w:val="20"/>
+        </w:rPr>
+        <w:t>Las armadas se generan automáticamente al aprobar la cotización y avisan cuando vencen; la factura y el cobro se emiten manualmente. Hoy una armada aparece lista para facturar desde que se crea.</w:t>
+      </w:r>
+    </w:p>
+    <w:p>
+      <w:r>
+        <w:rPr>
+          <w:b/>
+          <w:color w:val="E20627"/>
+          <w:sz w:val="20"/>
+        </w:rPr>
+        <w:t xml:space="preserve">Opciones a decidir: </w:t>
+      </w:r>
+      <w:r>
+        <w:rPr>
+          <w:sz w:val="20"/>
+        </w:rPr>
+        <w:t>Mantener así · o que una armada se habilite para facturar SOLO cuando el avance llegue a su % (ej. 'Valorización al 50%' recién al 50%).</w:t>
+      </w:r>
+    </w:p>
+    <w:tbl>
+      <w:tblPr>
+        <w:tblStyle w:val="TableGrid"/>
+        <w:tblW w:type="auto" w:w="0"/>
+        <w:tblLook w:firstColumn="1" w:firstRow="1" w:lastColumn="0" w:lastRow="0" w:noHBand="0" w:noVBand="1" w:val="04A0"/>
+      </w:tblPr>
+      <w:tblGrid>
+        <w:gridCol w:w="4320"/>
+        <w:gridCol w:w="4320"/>
+      </w:tblGrid>
+      <w:tr>
+        <w:tc>
+          <w:tcPr>
+            <w:tcW w:type="dxa" w:w="4608"/>
+            <w:shd w:val="clear" w:fill="BE1723"/>
+          </w:tcPr>
+          <w:p>
+            <w:pPr>
+              <w:jc w:val="center"/>
+            </w:pPr>
+            <w:r/>
+            <w:r>
+              <w:rPr>
+                <w:b/>
+                <w:color w:val="FFFFFF"/>
+                <w:sz w:val="18"/>
+              </w:rPr>
+              <w:t>Decisión de Juan/David</w:t>
+            </w:r>
+          </w:p>
+        </w:tc>
+        <w:tc>
+          <w:tcPr>
+            <w:tcW w:type="dxa" w:w="4752"/>
+            <w:shd w:val="clear" w:fill="BE1723"/>
+          </w:tcPr>
+          <w:p>
+            <w:pPr>
+              <w:jc w:val="center"/>
+            </w:pPr>
+            <w:r/>
+            <w:r>
+              <w:rPr>
+                <w:b/>
+                <w:color w:val="FFFFFF"/>
+                <w:sz w:val="18"/>
+              </w:rPr>
+              <w:t>Comentario</w:t>
+            </w:r>
+          </w:p>
+        </w:tc>
+      </w:tr>
+      <w:tr>
+        <w:tc>
+          <w:tcPr>
+            <w:tcW w:type="dxa" w:w="4608"/>
+          </w:tcPr>
+          <w:p>
+            <w:r/>
+            <w:r>
+              <w:rPr>
+                <w:b w:val="0"/>
+                <w:sz w:val="20"/>
+              </w:rPr>
+            </w:r>
+          </w:p>
+        </w:tc>
+        <w:tc>
+          <w:tcPr>
+            <w:tcW w:type="dxa" w:w="4752"/>
+          </w:tcPr>
+          <w:p>
+            <w:r/>
+            <w:r>
+              <w:rPr>
+                <w:b w:val="0"/>
+                <w:sz w:val="20"/>
+              </w:rPr>
+            </w:r>
+          </w:p>
+        </w:tc>
+      </w:tr>
+    </w:tbl>
+    <w:p/>
+    <w:p>
+      <w:pPr>
+        <w:pStyle w:val="Heading2"/>
+      </w:pPr>
+      <w:r>
+        <w:rPr>
+          <w:color w:val="BE1723"/>
+          <w:sz w:val="26"/>
+        </w:rPr>
+        <w:t>7.6 Pegado masivo desde MS Project / Excel (Last Planner)</w:t>
+      </w:r>
+    </w:p>
+    <w:p>
+      <w:r>
+        <w:rPr>
+          <w:b/>
+          <w:color w:val="BE1723"/>
+          <w:sz w:val="20"/>
+        </w:rPr>
+        <w:t xml:space="preserve">Estado actual: </w:t>
+      </w:r>
+      <w:r>
+        <w:rPr>
+          <w:sz w:val="20"/>
+        </w:rPr>
+        <w:t>Pendiente. Choca con la edición en tiempo real, por eso se dejó fuera por ahora.</w:t>
+      </w:r>
+    </w:p>
+    <w:p>
+      <w:r>
+        <w:rPr>
+          <w:b/>
+          <w:color w:val="E20627"/>
+          <w:sz w:val="20"/>
+        </w:rPr>
+        <w:t xml:space="preserve">Opciones a decidir: </w:t>
+      </w:r>
+      <w:r>
+        <w:rPr>
+          <w:sz w:val="20"/>
+        </w:rPr>
+        <w:t>Dejar fuera · o construir una IMPORTACIÓN separada (pegar/cargar) que no interfiera con el tiempo real.</w:t>
+      </w:r>
+    </w:p>
+    <w:tbl>
+      <w:tblPr>
+        <w:tblStyle w:val="TableGrid"/>
+        <w:tblW w:type="auto" w:w="0"/>
+        <w:tblLook w:firstColumn="1" w:firstRow="1" w:lastColumn="0" w:lastRow="0" w:noHBand="0" w:noVBand="1" w:val="04A0"/>
+      </w:tblPr>
+      <w:tblGrid>
+        <w:gridCol w:w="4320"/>
+        <w:gridCol w:w="4320"/>
+      </w:tblGrid>
+      <w:tr>
+        <w:tc>
+          <w:tcPr>
+            <w:tcW w:type="dxa" w:w="4608"/>
+            <w:shd w:val="clear" w:fill="BE1723"/>
+          </w:tcPr>
+          <w:p>
+            <w:pPr>
+              <w:jc w:val="center"/>
+            </w:pPr>
+            <w:r/>
+            <w:r>
+              <w:rPr>
+                <w:b/>
+                <w:color w:val="FFFFFF"/>
+                <w:sz w:val="18"/>
+              </w:rPr>
+              <w:t>Decisión de Juan/David</w:t>
+            </w:r>
+          </w:p>
+        </w:tc>
+        <w:tc>
+          <w:tcPr>
+            <w:tcW w:type="dxa" w:w="4752"/>
+            <w:shd w:val="clear" w:fill="BE1723"/>
+          </w:tcPr>
+          <w:p>
+            <w:pPr>
+              <w:jc w:val="center"/>
+            </w:pPr>
+            <w:r/>
+            <w:r>
+              <w:rPr>
+                <w:b/>
+                <w:color w:val="FFFFFF"/>
+                <w:sz w:val="18"/>
+              </w:rPr>
+              <w:t>Comentario</w:t>
+            </w:r>
+          </w:p>
+        </w:tc>
+      </w:tr>
+      <w:tr>
+        <w:tc>
+          <w:tcPr>
+            <w:tcW w:type="dxa" w:w="4608"/>
+          </w:tcPr>
+          <w:p>
+            <w:r/>
+            <w:r>
+              <w:rPr>
+                <w:b w:val="0"/>
+                <w:sz w:val="20"/>
+              </w:rPr>
+            </w:r>
+          </w:p>
+        </w:tc>
+        <w:tc>
+          <w:tcPr>
+            <w:tcW w:type="dxa" w:w="4752"/>
+          </w:tcPr>
+          <w:p>
+            <w:r/>
+            <w:r>
+              <w:rPr>
+                <w:b w:val="0"/>
+                <w:sz w:val="20"/>
+              </w:rPr>
+            </w:r>
+          </w:p>
+        </w:tc>
+      </w:tr>
+    </w:tbl>
+    <w:p/>
+    <w:p>
+      <w:r>
+        <w:br w:type="page"/>
+      </w:r>
+    </w:p>
+    <w:p>
+      <w:pPr>
+        <w:pStyle w:val="Heading1"/>
+      </w:pPr>
+      <w:r>
+        <w:rPr>
+          <w:color w:val="E20627"/>
+          <w:sz w:val="32"/>
+        </w:rPr>
+        <w:t>8. Registro general de observaciones</w:t>
       </w:r>
     </w:p>
     <w:p>

</xml_diff>

<commit_message>
docs(guia): agrega 'Novedades de esta version' (resumen) al inicio del documento
Co-Authored-By: Claude Opus 4.8 <noreply@anthropic.com>
</commit_message>
<xml_diff>
--- a/GUIA_PRUEBAS_ACTUALIZACIONES_AZUR.docx
+++ b/GUIA_PRUEBAS_ACTUALIZACIONES_AZUR.docx
@@ -89,6 +89,308 @@
           <w:sz w:val="19"/>
         </w:rPr>
         <w:t>Versión de pruebas validada: el motor de cálculo (fórmulas de costo, plazos, valorización, adelanto y márgenes) fue verificado con 34 pruebas automáticas (34/34 OK) y el build de producción compila correctamente.</w:t>
+      </w:r>
+    </w:p>
+    <w:p>
+      <w:r>
+        <w:br w:type="page"/>
+      </w:r>
+    </w:p>
+    <w:p>
+      <w:pPr>
+        <w:pStyle w:val="Heading1"/>
+      </w:pPr>
+      <w:r>
+        <w:rPr>
+          <w:color w:val="E20627"/>
+          <w:sz w:val="32"/>
+        </w:rPr>
+        <w:t>Novedades de esta versión (resumen)</w:t>
+      </w:r>
+    </w:p>
+    <w:p>
+      <w:r>
+        <w:rPr>
+          <w:color w:val="666666"/>
+          <w:sz w:val="20"/>
+        </w:rPr>
+        <w:t>Lista corta de todo lo nuevo. El detalle paso a paso está en las secciones siguientes.</w:t>
+      </w:r>
+    </w:p>
+    <w:p>
+      <w:pPr>
+        <w:pStyle w:val="Heading2"/>
+      </w:pPr>
+      <w:r>
+        <w:rPr>
+          <w:color w:val="BE1723"/>
+          <w:sz w:val="26"/>
+        </w:rPr>
+        <w:t>Cotización</w:t>
+      </w:r>
+    </w:p>
+    <w:p>
+      <w:pPr>
+        <w:pStyle w:val="ListBullet"/>
+      </w:pPr>
+      <w:r>
+        <w:rPr>
+          <w:sz w:val="20"/>
+        </w:rPr>
+        <w:t>Moneda en dólares (USD) con tipo de cambio que define el usuario y equivalente en soles (opcional).</w:t>
+      </w:r>
+    </w:p>
+    <w:p>
+      <w:pPr>
+        <w:pStyle w:val="ListBullet"/>
+      </w:pPr>
+      <w:r>
+        <w:rPr>
+          <w:sz w:val="20"/>
+        </w:rPr>
+        <w:t>Costo unitario tipo calculadora (fórmulas =40/1.18, (100+50)/2) que se guardan y se ven.</w:t>
+      </w:r>
+    </w:p>
+    <w:p>
+      <w:pPr>
+        <w:pStyle w:val="ListBullet"/>
+      </w:pPr>
+      <w:r>
+        <w:rPr>
+          <w:sz w:val="20"/>
+        </w:rPr>
+        <w:t>Colores por nivel en el cuadro de costos; unidades por lista + texto libre.</w:t>
+      </w:r>
+    </w:p>
+    <w:p>
+      <w:pPr>
+        <w:pStyle w:val="ListBullet"/>
+      </w:pPr>
+      <w:r>
+        <w:rPr>
+          <w:sz w:val="20"/>
+        </w:rPr>
+        <w:t>Cambios de configuración (mostrar GG/GA/IGV, descuento, moneda) inmediatos, sin recargar.</w:t>
+      </w:r>
+    </w:p>
+    <w:p>
+      <w:pPr>
+        <w:pStyle w:val="ListBullet"/>
+      </w:pPr>
+      <w:r>
+        <w:rPr>
+          <w:sz w:val="20"/>
+        </w:rPr>
+        <w:t>PDF con forma de pago y firma del responsable; tipo de plazo (calendario/útiles/semanas/meses).</w:t>
+      </w:r>
+    </w:p>
+    <w:p>
+      <w:pPr>
+        <w:pStyle w:val="ListBullet"/>
+      </w:pPr>
+      <w:r>
+        <w:rPr>
+          <w:sz w:val="20"/>
+        </w:rPr>
+        <w:t>Excel con celdas en fórmula (Subtotal, P. Unit, etc.) que recalculan al editar.</w:t>
+      </w:r>
+    </w:p>
+    <w:p>
+      <w:pPr>
+        <w:pStyle w:val="ListBullet"/>
+      </w:pPr>
+      <w:r>
+        <w:rPr>
+          <w:sz w:val="20"/>
+        </w:rPr>
+        <w:t>Pantalla inicial: moneda, tipo de cambio, plazo (opcional con check) y recomendado-por.</w:t>
+      </w:r>
+    </w:p>
+    <w:p>
+      <w:pPr>
+        <w:pStyle w:val="Heading2"/>
+      </w:pPr>
+      <w:r>
+        <w:rPr>
+          <w:color w:val="BE1723"/>
+          <w:sz w:val="26"/>
+        </w:rPr>
+        <w:t>Proyecto / Last Planner</w:t>
+      </w:r>
+    </w:p>
+    <w:p>
+      <w:pPr>
+        <w:pStyle w:val="ListBullet"/>
+      </w:pPr>
+      <w:r>
+        <w:rPr>
+          <w:sz w:val="20"/>
+        </w:rPr>
+        <w:t>Numeración y color por nivel; valorización con % y monto en paralelo (bidireccional) y fila de TOTALES.</w:t>
+      </w:r>
+    </w:p>
+    <w:p>
+      <w:pPr>
+        <w:pStyle w:val="ListBullet"/>
+      </w:pPr>
+      <w:r>
+        <w:rPr>
+          <w:sz w:val="20"/>
+        </w:rPr>
+        <w:t>Plazos por calendario + botón 'Recalcular fechas'; corregido el desfase de un día en fechas.</w:t>
+      </w:r>
+    </w:p>
+    <w:p>
+      <w:pPr>
+        <w:pStyle w:val="ListBullet"/>
+      </w:pPr>
+      <w:r>
+        <w:rPr>
+          <w:sz w:val="20"/>
+        </w:rPr>
+        <w:t>Base de valorización configurable: Costo o Precio (con margen).</w:t>
+      </w:r>
+    </w:p>
+    <w:p>
+      <w:pPr>
+        <w:pStyle w:val="ListBullet"/>
+      </w:pPr>
+      <w:r>
+        <w:rPr>
+          <w:sz w:val="20"/>
+        </w:rPr>
+        <w:t>Aprobaciones de cantidad/costo (Presupuestos) y reapertura de valorización (Gerencia directa).</w:t>
+      </w:r>
+    </w:p>
+    <w:p>
+      <w:pPr>
+        <w:pStyle w:val="ListBullet"/>
+      </w:pPr>
+      <w:r>
+        <w:rPr>
+          <w:sz w:val="20"/>
+        </w:rPr>
+        <w:t>Itemizado propio + comparativo Comercial vs Proyecto; presupuesto por tipo de gasto.</w:t>
+      </w:r>
+    </w:p>
+    <w:p>
+      <w:pPr>
+        <w:pStyle w:val="ListBullet"/>
+      </w:pPr>
+      <w:r>
+        <w:rPr>
+          <w:sz w:val="20"/>
+        </w:rPr>
+        <w:t>Adelantos adicionales/extraordinarios que se diluyen junto con el del contrato.</w:t>
+      </w:r>
+    </w:p>
+    <w:p>
+      <w:pPr>
+        <w:pStyle w:val="Heading2"/>
+      </w:pPr>
+      <w:r>
+        <w:rPr>
+          <w:color w:val="BE1723"/>
+          <w:sz w:val="26"/>
+        </w:rPr>
+        <w:t>Informe / Finanzas</w:t>
+      </w:r>
+    </w:p>
+    <w:p>
+      <w:pPr>
+        <w:pStyle w:val="ListBullet"/>
+      </w:pPr>
+      <w:r>
+        <w:rPr>
+          <w:sz w:val="20"/>
+        </w:rPr>
+        <w:t>Informe de valorización con adelanto, valorizaciones acumuladas, detalle por partida y firmas.</w:t>
+      </w:r>
+    </w:p>
+    <w:p>
+      <w:pPr>
+        <w:pStyle w:val="ListBullet"/>
+      </w:pPr>
+      <w:r>
+        <w:rPr>
+          <w:sz w:val="20"/>
+        </w:rPr>
+        <w:t>Crear requerimiento de pago desde la web; flujo de pago con roles corregidos (Gerencia paga).</w:t>
+      </w:r>
+    </w:p>
+    <w:p>
+      <w:pPr>
+        <w:pStyle w:val="ListBullet"/>
+      </w:pPr>
+      <w:r>
+        <w:rPr>
+          <w:sz w:val="20"/>
+        </w:rPr>
+        <w:t>Estado financiero por proyecto y caja chica por residente con control semanal.</w:t>
+      </w:r>
+    </w:p>
+    <w:p>
+      <w:pPr>
+        <w:pStyle w:val="ListBullet"/>
+      </w:pPr>
+      <w:r>
+        <w:rPr>
+          <w:sz w:val="20"/>
+        </w:rPr>
+        <w:t>RUC/CCI, cuenta de detracción y múltiples cuentas bancarias para proveedor y cliente.</w:t>
+      </w:r>
+    </w:p>
+    <w:p>
+      <w:pPr>
+        <w:pStyle w:val="Heading2"/>
+      </w:pPr>
+      <w:r>
+        <w:rPr>
+          <w:color w:val="BE1723"/>
+          <w:sz w:val="26"/>
+        </w:rPr>
+        <w:t>Reportes y correcciones</w:t>
+      </w:r>
+    </w:p>
+    <w:p>
+      <w:pPr>
+        <w:pStyle w:val="ListBullet"/>
+      </w:pPr>
+      <w:r>
+        <w:rPr>
+          <w:sz w:val="20"/>
+        </w:rPr>
+        <w:t>Proyectado vs Real por tipo de gasto; Curva S e Ingresos vs Egresos con títulos de eje.</w:t>
+      </w:r>
+    </w:p>
+    <w:p>
+      <w:pPr>
+        <w:pStyle w:val="ListBullet"/>
+      </w:pPr>
+      <w:r>
+        <w:rPr>
+          <w:sz w:val="20"/>
+        </w:rPr>
+        <w:t>Tarjetas KPI sin solapamiento de íconos en pantallas chicas / doble monitor.</w:t>
+      </w:r>
+    </w:p>
+    <w:p>
+      <w:pPr>
+        <w:ind w:left="288"/>
+      </w:pPr>
+      <w:r>
+        <w:rPr>
+          <w:sz w:val="19"/>
+        </w:rPr>
+        <w:t xml:space="preserve">💡 </w:t>
+      </w:r>
+      <w:r>
+        <w:rPr>
+          <w:i/>
+          <w:color w:val="335588"/>
+          <w:sz w:val="19"/>
+        </w:rPr>
+        <w:t>Validado: motor de cálculo con 34 pruebas automáticas (34/34 OK) y build de producción sin errores.</w:t>
       </w:r>
     </w:p>
     <w:p>

</xml_diff>